<commit_message>
change about me content
</commit_message>
<xml_diff>
--- a/public/CVTemplate.docx
+++ b/public/CVTemplate.docx
@@ -11,6 +11,7 @@
           <w:lang w:val="en-US"/>
         </w:rPr>
       </w:pPr>
+      <w:bookmarkStart w:id="0" w:name="_GoBack"/>
       <w:r>
         <w:rPr>
           <w:rFonts w:hint="default"/>
@@ -19,9 +20,9 @@
         </w:rPr>
         <w:drawing>
           <wp:inline distT="0" distB="0" distL="114300" distR="114300">
-            <wp:extent cx="2019300" cy="2121535"/>
-            <wp:effectExtent l="0" t="0" r="0" b="12065"/>
-            <wp:docPr id="1" name="Picture 1" descr="1"/>
+            <wp:extent cx="2025015" cy="1637665"/>
+            <wp:effectExtent l="9525" t="9525" r="22860" b="10160"/>
+            <wp:docPr id="3" name="Picture 3" descr="walid-removebg-preview"/>
             <wp:cNvGraphicFramePr>
               <a:graphicFrameLocks xmlns:a="http://schemas.openxmlformats.org/drawingml/2006/main" noChangeAspect="1"/>
             </wp:cNvGraphicFramePr>
@@ -29,13 +30,15 @@
               <a:graphicData uri="http://schemas.openxmlformats.org/drawingml/2006/picture">
                 <pic:pic xmlns:pic="http://schemas.openxmlformats.org/drawingml/2006/picture">
                   <pic:nvPicPr>
-                    <pic:cNvPr id="1" name="Picture 1" descr="1"/>
+                    <pic:cNvPr id="3" name="Picture 3" descr="walid-removebg-preview"/>
                     <pic:cNvPicPr>
                       <a:picLocks noChangeAspect="1"/>
                     </pic:cNvPicPr>
                   </pic:nvPicPr>
                   <pic:blipFill>
-                    <a:blip r:embed="rId5"/>
+                    <a:blip r:embed="rId5">
+                      <a:lum bright="24000"/>
+                    </a:blip>
                     <a:stretch>
                       <a:fillRect/>
                     </a:stretch>
@@ -43,12 +46,19 @@
                   <pic:spPr>
                     <a:xfrm>
                       <a:off x="0" y="0"/>
-                      <a:ext cx="2019300" cy="2121535"/>
+                      <a:ext cx="2025015" cy="1637665"/>
                     </a:xfrm>
-                    <a:prstGeom prst="rect">
+                    <a:prstGeom prst="ellipse">
                       <a:avLst/>
                     </a:prstGeom>
-                    <a:effectLst/>
+                    <a:ln>
+                      <a:solidFill>
+                        <a:schemeClr val="accent1">
+                          <a:lumMod val="20000"/>
+                          <a:lumOff val="80000"/>
+                        </a:schemeClr>
+                      </a:solidFill>
+                    </a:ln>
                   </pic:spPr>
                 </pic:pic>
               </a:graphicData>
@@ -56,6 +66,7 @@
           </wp:inline>
         </w:drawing>
       </w:r>
+      <w:bookmarkEnd w:id="0"/>
     </w:p>
     <w:p>
       <w:pPr>
@@ -704,8 +715,6 @@
           <w:lang w:val="en-US"/>
         </w:rPr>
       </w:pPr>
-      <w:bookmarkStart w:id="0" w:name="_GoBack"/>
-      <w:bookmarkEnd w:id="0"/>
     </w:p>
     <w:p/>
     <w:p>
@@ -1323,7 +1332,7 @@
           </mc:Choice>
           <mc:Fallback>
             <w:pict>
-              <v:line id="_x0000_s1026" o:spid="_x0000_s1026" o:spt="20" style="position:absolute;left:0pt;margin-left:0.4pt;margin-top:5.45pt;height:0.7pt;width:345.2pt;z-index:251664384;mso-width-relative:page;mso-height-relative:page;" filled="f" stroked="t" coordsize="21600,21600" o:gfxdata="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">
+              <v:line id="_x0000_s1026" o:spid="_x0000_s1026" o:spt="20" style="position:absolute;left:0pt;margin-left:0.4pt;margin-top:5.45pt;height:0.7pt;width:345.2pt;z-index:251664384;mso-width-relative:page;mso-height-relative:page;" filled="f" stroked="t" coordsize="21600,21600" o:gfxdata="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">
                 <v:fill on="f" focussize="0,0"/>
                 <v:stroke weight="1.5pt" color="#000000 [3200]" miterlimit="8" joinstyle="miter"/>
                 <v:imagedata o:title=""/>
@@ -2270,7 +2279,7 @@
           </mc:Choice>
           <mc:Fallback>
             <w:pict>
-              <v:line id="_x0000_s1026" o:spid="_x0000_s1026" o:spt="20" style="position:absolute;left:0pt;margin-left:0.35pt;margin-top:3.6pt;height:0.9pt;width:347.1pt;z-index:251663360;mso-width-relative:page;mso-height-relative:page;" filled="f" stroked="t" coordsize="21600,21600" o:gfxdata="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">
+              <v:line id="_x0000_s1026" o:spid="_x0000_s1026" o:spt="20" style="position:absolute;left:0pt;margin-left:0.35pt;margin-top:3.6pt;height:0.9pt;width:347.1pt;z-index:251663360;mso-width-relative:page;mso-height-relative:page;" filled="f" stroked="t" coordsize="21600,21600" o:gfxdata="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">
                 <v:fill on="f" focussize="0,0"/>
                 <v:stroke weight="1.5pt" color="#000000 [3200]" miterlimit="8" joinstyle="miter"/>
                 <v:imagedata o:title=""/>
@@ -2593,8 +2602,8 @@
     <w:lsdException w:unhideWhenUsed="0" w:uiPriority="0" w:semiHidden="0" w:name="Normal Indent"/>
     <w:lsdException w:unhideWhenUsed="0" w:uiPriority="0" w:semiHidden="0" w:name="footnote text"/>
     <w:lsdException w:unhideWhenUsed="0" w:uiPriority="0" w:semiHidden="0" w:name="annotation text"/>
-    <w:lsdException w:unhideWhenUsed="0" w:uiPriority="0" w:semiHidden="0" w:name="header"/>
-    <w:lsdException w:unhideWhenUsed="0" w:uiPriority="0" w:semiHidden="0" w:name="footer"/>
+    <w:lsdException w:qFormat="1" w:unhideWhenUsed="0" w:uiPriority="0" w:semiHidden="0" w:name="header"/>
+    <w:lsdException w:qFormat="1" w:unhideWhenUsed="0" w:uiPriority="0" w:semiHidden="0" w:name="footer"/>
     <w:lsdException w:unhideWhenUsed="0" w:uiPriority="0" w:semiHidden="0" w:name="index heading"/>
     <w:lsdException w:qFormat="1" w:uiPriority="0" w:name="caption"/>
     <w:lsdException w:unhideWhenUsed="0" w:uiPriority="0" w:semiHidden="0" w:name="table of figures"/>
@@ -2661,7 +2670,7 @@
     <w:lsdException w:unhideWhenUsed="0" w:uiPriority="0" w:semiHidden="0" w:name="HTML Code"/>
     <w:lsdException w:unhideWhenUsed="0" w:uiPriority="0" w:semiHidden="0" w:name="HTML Definition"/>
     <w:lsdException w:unhideWhenUsed="0" w:uiPriority="0" w:semiHidden="0" w:name="HTML Keyboard"/>
-    <w:lsdException w:unhideWhenUsed="0" w:uiPriority="0" w:semiHidden="0" w:name="HTML Preformatted"/>
+    <w:lsdException w:qFormat="1" w:unhideWhenUsed="0" w:uiPriority="0" w:semiHidden="0" w:name="HTML Preformatted"/>
     <w:lsdException w:unhideWhenUsed="0" w:uiPriority="0" w:semiHidden="0" w:name="HTML Sample"/>
     <w:lsdException w:unhideWhenUsed="0" w:uiPriority="0" w:semiHidden="0" w:name="HTML Typewriter"/>
     <w:lsdException w:unhideWhenUsed="0" w:uiPriority="0" w:semiHidden="0" w:name="HTML Variable"/>
@@ -2710,7 +2719,7 @@
     <w:lsdException w:unhideWhenUsed="0" w:uiPriority="0" w:semiHidden="0" w:name="Table Web 2"/>
     <w:lsdException w:unhideWhenUsed="0" w:uiPriority="0" w:semiHidden="0" w:name="Table Web 3"/>
     <w:lsdException w:unhideWhenUsed="0" w:uiPriority="0" w:semiHidden="0" w:name="Balloon Text"/>
-    <w:lsdException w:unhideWhenUsed="0" w:uiPriority="0" w:semiHidden="0" w:name="Table Grid"/>
+    <w:lsdException w:qFormat="1" w:unhideWhenUsed="0" w:uiPriority="0" w:semiHidden="0" w:name="Table Grid"/>
     <w:lsdException w:unhideWhenUsed="0" w:uiPriority="0" w:semiHidden="0" w:name="Table Theme"/>
     <w:lsdException w:unhideWhenUsed="0" w:uiPriority="60" w:semiHidden="0" w:name="Light Shading"/>
     <w:lsdException w:unhideWhenUsed="0" w:uiPriority="61" w:semiHidden="0" w:name="Light List"/>
@@ -2842,6 +2851,7 @@
   <w:style w:type="paragraph" w:styleId="4">
     <w:name w:val="footer"/>
     <w:basedOn w:val="1"/>
+    <w:qFormat/>
     <w:uiPriority w:val="0"/>
     <w:pPr>
       <w:tabs>
@@ -2859,6 +2869,7 @@
   <w:style w:type="paragraph" w:styleId="5">
     <w:name w:val="header"/>
     <w:basedOn w:val="1"/>
+    <w:qFormat/>
     <w:uiPriority w:val="0"/>
     <w:pPr>
       <w:tabs>
@@ -2874,6 +2885,7 @@
   </w:style>
   <w:style w:type="paragraph" w:styleId="6">
     <w:name w:val="HTML Preformatted"/>
+    <w:qFormat/>
     <w:uiPriority w:val="0"/>
     <w:pPr>
       <w:tabs>
@@ -2907,6 +2919,7 @@
   <w:style w:type="table" w:styleId="7">
     <w:name w:val="Table Grid"/>
     <w:basedOn w:val="3"/>
+    <w:qFormat/>
     <w:uiPriority w:val="0"/>
     <w:pPr>
       <w:widowControl w:val="0"/>

</xml_diff>